<commit_message>
Cá nhân hóa website và cập nhật báo cáo
</commit_message>
<xml_diff>
--- a/BaoCaoKyNangSo.docx
+++ b/BaoCaoKyNangSo.docx
@@ -150,7 +150,7 @@
                 <w:rFonts w:ascii="Arial" w:hAnsi="Arial" w:eastAsia="Arial"/>
                 <w:sz w:val="17"/>
               </w:rPr>
-              <w:t>Đối tượng</w:t>
+              <w:t>Họ và tên</w:t>
             </w:r>
           </w:p>
         </w:tc>
@@ -174,7 +174,7 @@
                 <w:rFonts w:ascii="Arial" w:hAnsi="Arial" w:eastAsia="Arial"/>
                 <w:sz w:val="17"/>
               </w:rPr>
-              <w:t>Sinh viên khóa 52</w:t>
+              <w:t>Trần Ngọc Mơ</w:t>
             </w:r>
           </w:p>
         </w:tc>
@@ -201,6 +201,159 @@
                 <w:rFonts w:ascii="Arial" w:hAnsi="Arial" w:eastAsia="Arial"/>
                 <w:sz w:val="17"/>
               </w:rPr>
+              <w:t>Mã sinh viên</w:t>
+            </w:r>
+          </w:p>
+        </w:tc>
+        <w:tc>
+          <w:tcPr>
+            <w:tcW w:type="dxa" w:w="6690"/>
+            <w:vAlign w:val="center"/>
+            <w:tcMar>
+              <w:top w:w="90" w:type="dxa"/>
+              <w:start w:w="120" w:type="dxa"/>
+              <w:bottom w:w="90" w:type="dxa"/>
+              <w:end w:w="120" w:type="dxa"/>
+            </w:tcMar>
+            <w:shd w:fill="F3F8FA"/>
+          </w:tcPr>
+          <w:p>
+            <w:pPr>
+              <w:spacing w:after="0"/>
+            </w:pPr>
+            <w:r>
+              <w:rPr>
+                <w:rFonts w:ascii="Arial" w:hAnsi="Arial" w:eastAsia="Arial"/>
+                <w:sz w:val="17"/>
+              </w:rPr>
+              <w:t>B2605357</w:t>
+            </w:r>
+          </w:p>
+        </w:tc>
+      </w:tr>
+      <w:tr>
+        <w:tc>
+          <w:tcPr>
+            <w:tcW w:type="dxa" w:w="2835"/>
+            <w:vAlign w:val="center"/>
+            <w:tcMar>
+              <w:top w:w="90" w:type="dxa"/>
+              <w:start w:w="120" w:type="dxa"/>
+              <w:bottom w:w="90" w:type="dxa"/>
+              <w:end w:w="120" w:type="dxa"/>
+            </w:tcMar>
+          </w:tcPr>
+          <w:p>
+            <w:pPr>
+              <w:spacing w:after="0"/>
+            </w:pPr>
+            <w:r>
+              <w:rPr>
+                <w:rFonts w:ascii="Arial" w:hAnsi="Arial" w:eastAsia="Arial"/>
+                <w:sz w:val="17"/>
+              </w:rPr>
+              <w:t>Lớp và khóa</w:t>
+            </w:r>
+          </w:p>
+        </w:tc>
+        <w:tc>
+          <w:tcPr>
+            <w:tcW w:type="dxa" w:w="6690"/>
+            <w:vAlign w:val="center"/>
+            <w:tcMar>
+              <w:top w:w="90" w:type="dxa"/>
+              <w:start w:w="120" w:type="dxa"/>
+              <w:bottom w:w="90" w:type="dxa"/>
+              <w:end w:w="120" w:type="dxa"/>
+            </w:tcMar>
+          </w:tcPr>
+          <w:p>
+            <w:pPr>
+              <w:spacing w:after="0"/>
+            </w:pPr>
+            <w:r>
+              <w:rPr>
+                <w:rFonts w:ascii="Arial" w:hAnsi="Arial" w:eastAsia="Arial"/>
+                <w:sz w:val="17"/>
+              </w:rPr>
+              <w:t>26D1A2 - Khóa 52</w:t>
+            </w:r>
+          </w:p>
+        </w:tc>
+      </w:tr>
+      <w:tr>
+        <w:tc>
+          <w:tcPr>
+            <w:tcW w:type="dxa" w:w="2835"/>
+            <w:vAlign w:val="center"/>
+            <w:tcMar>
+              <w:top w:w="90" w:type="dxa"/>
+              <w:start w:w="120" w:type="dxa"/>
+              <w:bottom w:w="90" w:type="dxa"/>
+              <w:end w:w="120" w:type="dxa"/>
+            </w:tcMar>
+            <w:shd w:fill="F3F8FA"/>
+          </w:tcPr>
+          <w:p>
+            <w:pPr>
+              <w:spacing w:after="0"/>
+            </w:pPr>
+            <w:r>
+              <w:rPr>
+                <w:rFonts w:ascii="Arial" w:hAnsi="Arial" w:eastAsia="Arial"/>
+                <w:sz w:val="17"/>
+              </w:rPr>
+              <w:t>Ngành</w:t>
+            </w:r>
+          </w:p>
+        </w:tc>
+        <w:tc>
+          <w:tcPr>
+            <w:tcW w:type="dxa" w:w="6690"/>
+            <w:vAlign w:val="center"/>
+            <w:tcMar>
+              <w:top w:w="90" w:type="dxa"/>
+              <w:start w:w="120" w:type="dxa"/>
+              <w:bottom w:w="90" w:type="dxa"/>
+              <w:end w:w="120" w:type="dxa"/>
+            </w:tcMar>
+            <w:shd w:fill="F3F8FA"/>
+          </w:tcPr>
+          <w:p>
+            <w:pPr>
+              <w:spacing w:after="0"/>
+            </w:pPr>
+            <w:r>
+              <w:rPr>
+                <w:rFonts w:ascii="Arial" w:hAnsi="Arial" w:eastAsia="Arial"/>
+                <w:sz w:val="17"/>
+              </w:rPr>
+              <w:t>Truyền thông đa phương tiện</w:t>
+            </w:r>
+          </w:p>
+        </w:tc>
+      </w:tr>
+      <w:tr>
+        <w:tc>
+          <w:tcPr>
+            <w:tcW w:type="dxa" w:w="2835"/>
+            <w:vAlign w:val="center"/>
+            <w:tcMar>
+              <w:top w:w="90" w:type="dxa"/>
+              <w:start w:w="120" w:type="dxa"/>
+              <w:bottom w:w="90" w:type="dxa"/>
+              <w:end w:w="120" w:type="dxa"/>
+            </w:tcMar>
+          </w:tcPr>
+          <w:p>
+            <w:pPr>
+              <w:spacing w:after="0"/>
+            </w:pPr>
+            <w:r>
+              <w:rPr>
+                <w:rFonts w:ascii="Arial" w:hAnsi="Arial" w:eastAsia="Arial"/>
+                <w:sz w:val="17"/>
+              </w:rPr>
               <w:t>Thời gian thực hiện</w:t>
             </w:r>
           </w:p>
@@ -215,7 +368,6 @@
               <w:bottom w:w="90" w:type="dxa"/>
               <w:end w:w="120" w:type="dxa"/>
             </w:tcMar>
-            <w:shd w:fill="F3F8FA"/>
           </w:tcPr>
           <w:p>
             <w:pPr>
@@ -242,6 +394,7 @@
               <w:bottom w:w="90" w:type="dxa"/>
               <w:end w:w="120" w:type="dxa"/>
             </w:tcMar>
+            <w:shd w:fill="F3F8FA"/>
           </w:tcPr>
           <w:p>
             <w:pPr>
@@ -266,6 +419,7 @@
               <w:bottom w:w="90" w:type="dxa"/>
               <w:end w:w="120" w:type="dxa"/>
             </w:tcMar>
+            <w:shd w:fill="F3F8FA"/>
           </w:tcPr>
           <w:p>
             <w:pPr>
@@ -277,58 +431,6 @@
                 <w:sz w:val="17"/>
               </w:rPr>
               <w:t>03/10/2026</w:t>
-            </w:r>
-          </w:p>
-        </w:tc>
-      </w:tr>
-      <w:tr>
-        <w:tc>
-          <w:tcPr>
-            <w:tcW w:type="dxa" w:w="2835"/>
-            <w:vAlign w:val="center"/>
-            <w:tcMar>
-              <w:top w:w="90" w:type="dxa"/>
-              <w:start w:w="120" w:type="dxa"/>
-              <w:bottom w:w="90" w:type="dxa"/>
-              <w:end w:w="120" w:type="dxa"/>
-            </w:tcMar>
-            <w:shd w:fill="F3F8FA"/>
-          </w:tcPr>
-          <w:p>
-            <w:pPr>
-              <w:spacing w:after="0"/>
-            </w:pPr>
-            <w:r>
-              <w:rPr>
-                <w:rFonts w:ascii="Arial" w:hAnsi="Arial" w:eastAsia="Arial"/>
-                <w:sz w:val="17"/>
-              </w:rPr>
-              <w:t>Thư mục bài làm</w:t>
-            </w:r>
-          </w:p>
-        </w:tc>
-        <w:tc>
-          <w:tcPr>
-            <w:tcW w:type="dxa" w:w="6690"/>
-            <w:vAlign w:val="center"/>
-            <w:tcMar>
-              <w:top w:w="90" w:type="dxa"/>
-              <w:start w:w="120" w:type="dxa"/>
-              <w:bottom w:w="90" w:type="dxa"/>
-              <w:end w:w="120" w:type="dxa"/>
-            </w:tcMar>
-            <w:shd w:fill="F3F8FA"/>
-          </w:tcPr>
-          <w:p>
-            <w:pPr>
-              <w:spacing w:after="0"/>
-            </w:pPr>
-            <w:r>
-              <w:rPr>
-                <w:rFonts w:ascii="Arial" w:hAnsi="Arial" w:eastAsia="Arial"/>
-                <w:sz w:val="17"/>
-              </w:rPr>
-              <w:t>lab07</w:t>
             </w:r>
           </w:p>
         </w:tc>
@@ -958,7 +1060,7 @@
         <w:rPr>
           <w:rFonts w:ascii="Arial" w:hAnsi="Arial" w:eastAsia="Arial"/>
         </w:rPr>
-        <w:t>Website một trang được xây dựng bằng HTML, CSS và JavaScript, sẵn sàng xuất bản bằng GitHub Pages.</w:t>
+        <w:t>Website của Trần Ngọc Mơ được xây dựng bằng HTML, CSS và xuất bản công khai bằng GitHub Pages.</w:t>
       </w:r>
     </w:p>
     <w:p>
@@ -968,7 +1070,7 @@
         </w:rPr>
         <w:drawing>
           <wp:inline xmlns:a="http://schemas.openxmlformats.org/drawingml/2006/main" xmlns:pic="http://schemas.openxmlformats.org/drawingml/2006/picture">
-            <wp:extent cx="6083999" cy="4224999"/>
+            <wp:extent cx="6083999" cy="4647499"/>
             <wp:docPr id="3" name="Picture 3"/>
             <wp:cNvGraphicFramePr>
               <a:graphicFrameLocks noChangeAspect="1"/>
@@ -989,7 +1091,7 @@
                   <pic:spPr>
                     <a:xfrm>
                       <a:off x="0" y="0"/>
-                      <a:ext cx="6083999" cy="4224999"/>
+                      <a:ext cx="6083999" cy="4647499"/>
                     </a:xfrm>
                     <a:prstGeom prst="rect"/>
                   </pic:spPr>
@@ -1135,7 +1237,7 @@
                 <w:rFonts w:ascii="Arial" w:hAnsi="Arial" w:eastAsia="Arial"/>
                 <w:sz w:val="17"/>
               </w:rPr>
-              <w:t>Định hướng học tập và cách tiếp cận sản phẩm</w:t>
+              <w:t>Trần Ngọc Mơ, sinh ngày 18/09/2007, đến từ Bạc Liêu</w:t>
             </w:r>
           </w:p>
         </w:tc>
@@ -1162,7 +1264,7 @@
                 <w:rFonts w:ascii="Arial" w:hAnsi="Arial" w:eastAsia="Arial"/>
                 <w:sz w:val="17"/>
               </w:rPr>
-              <w:t>Lĩnh vực chuyên môn</w:t>
+              <w:t>Quá trình học</w:t>
             </w:r>
           </w:p>
         </w:tc>
@@ -1187,7 +1289,7 @@
                 <w:rFonts w:ascii="Arial" w:hAnsi="Arial" w:eastAsia="Arial"/>
                 <w:sz w:val="17"/>
               </w:rPr>
-              <w:t>Phát triển web, Git, cộng tác số và giải quyết vấn đề</w:t>
+              <w:t>Sinh viên khóa 52, lớp 26D1A2, mã sinh viên B2605357</w:t>
             </w:r>
           </w:p>
         </w:tc>
@@ -1213,7 +1315,7 @@
                 <w:rFonts w:ascii="Arial" w:hAnsi="Arial" w:eastAsia="Arial"/>
                 <w:sz w:val="17"/>
               </w:rPr>
-              <w:t>Quá trình học</w:t>
+              <w:t>Lĩnh vực chuyên môn</w:t>
             </w:r>
           </w:p>
         </w:tc>
@@ -1237,7 +1339,7 @@
                 <w:rFonts w:ascii="Arial" w:hAnsi="Arial" w:eastAsia="Arial"/>
                 <w:sz w:val="17"/>
               </w:rPr>
-              <w:t>Nền tảng ngành, thực hành sản phẩm và mục tiêu nghề nghiệp</w:t>
+              <w:t>Truyền thông đa phương tiện, nội dung số và công cụ cộng tác</w:t>
             </w:r>
           </w:p>
         </w:tc>
@@ -1264,7 +1366,7 @@
                 <w:rFonts w:ascii="Arial" w:hAnsi="Arial" w:eastAsia="Arial"/>
                 <w:sz w:val="17"/>
               </w:rPr>
-              <w:t>Sản phẩm</w:t>
+              <w:t>Kinh nghiệm và sản phẩm</w:t>
             </w:r>
           </w:p>
         </w:tc>
@@ -1289,7 +1391,7 @@
                 <w:rFonts w:ascii="Arial" w:hAnsi="Arial" w:eastAsia="Arial"/>
                 <w:sz w:val="17"/>
               </w:rPr>
-              <w:t>Website cá nhân và bộ công cụ Lab 07</w:t>
+              <w:t>Google Forms, Google Calendar, website cá nhân và kế hoạch dự án Lab 07</w:t>
             </w:r>
           </w:p>
         </w:tc>
@@ -1307,7 +1409,7 @@
           <w:b/>
           <w:color w:val="12B8C4"/>
         </w:rPr>
-        <w:t>Đường dẫn nguồn: site/index.html</w:t>
+        <w:t>Đường dẫn công khai: https://codeezforme.github.io/B2605357-Lab07/</w:t>
       </w:r>
     </w:p>
     <w:p>
@@ -1956,7 +2058,7 @@
         </w:rPr>
         <w:drawing>
           <wp:inline xmlns:a="http://schemas.openxmlformats.org/drawingml/2006/main" xmlns:pic="http://schemas.openxmlformats.org/drawingml/2006/picture">
-            <wp:extent cx="6083999" cy="3612374"/>
+            <wp:extent cx="6083999" cy="3422249"/>
             <wp:docPr id="5" name="Picture 5"/>
             <wp:cNvGraphicFramePr>
               <a:graphicFrameLocks noChangeAspect="1"/>
@@ -1977,7 +2079,7 @@
                   <pic:spPr>
                     <a:xfrm>
                       <a:off x="0" y="0"/>
-                      <a:ext cx="6083999" cy="3612374"/>
+                      <a:ext cx="6083999" cy="3422249"/>
                     </a:xfrm>
                     <a:prstGeom prst="rect"/>
                   </pic:spPr>
@@ -2127,7 +2229,7 @@
                 <w:rFonts w:ascii="Arial" w:hAnsi="Arial" w:eastAsia="Arial"/>
                 <w:sz w:val="17"/>
               </w:rPr>
-              <w:t>Thành viên 1</w:t>
+              <w:t>Trần Ngọc Mơ</w:t>
             </w:r>
           </w:p>
         </w:tc>
@@ -2151,7 +2253,7 @@
                 <w:rFonts w:ascii="Arial" w:hAnsi="Arial" w:eastAsia="Arial"/>
                 <w:sz w:val="17"/>
               </w:rPr>
-              <w:t>Điều phối và frontend</w:t>
+              <w:t>Điều phối, giao diện và tài liệu</w:t>
             </w:r>
           </w:p>
         </w:tc>
@@ -2175,7 +2277,7 @@
                 <w:rFonts w:ascii="Arial" w:hAnsi="Arial" w:eastAsia="Arial"/>
                 <w:sz w:val="17"/>
               </w:rPr>
-              <w:t>Phạm vi, giao diện chính, bảng công việc</w:t>
+              <w:t>Phạm vi, giao diện chính, biểu đồ và hướng dẫn</w:t>
             </w:r>
           </w:p>
         </w:tc>
@@ -2278,81 +2380,6 @@
                 <w:rFonts w:ascii="Arial" w:hAnsi="Arial" w:eastAsia="Arial"/>
                 <w:sz w:val="17"/>
               </w:rPr>
-              <w:t>Thành viên 3</w:t>
-            </w:r>
-          </w:p>
-        </w:tc>
-        <w:tc>
-          <w:tcPr>
-            <w:tcW w:type="dxa" w:w="3515"/>
-            <w:vAlign w:val="center"/>
-            <w:tcMar>
-              <w:top w:w="90" w:type="dxa"/>
-              <w:start w:w="120" w:type="dxa"/>
-              <w:bottom w:w="90" w:type="dxa"/>
-              <w:end w:w="120" w:type="dxa"/>
-            </w:tcMar>
-          </w:tcPr>
-          <w:p>
-            <w:pPr>
-              <w:spacing w:after="0"/>
-            </w:pPr>
-            <w:r>
-              <w:rPr>
-                <w:rFonts w:ascii="Arial" w:hAnsi="Arial" w:eastAsia="Arial"/>
-                <w:sz w:val="17"/>
-              </w:rPr>
-              <w:t>Thiết kế trải nghiệm và tài liệu</w:t>
-            </w:r>
-          </w:p>
-        </w:tc>
-        <w:tc>
-          <w:tcPr>
-            <w:tcW w:type="dxa" w:w="4139"/>
-            <w:vAlign w:val="center"/>
-            <w:tcMar>
-              <w:top w:w="90" w:type="dxa"/>
-              <w:start w:w="120" w:type="dxa"/>
-              <w:bottom w:w="90" w:type="dxa"/>
-              <w:end w:w="120" w:type="dxa"/>
-            </w:tcMar>
-          </w:tcPr>
-          <w:p>
-            <w:pPr>
-              <w:spacing w:after="0"/>
-            </w:pPr>
-            <w:r>
-              <w:rPr>
-                <w:rFonts w:ascii="Arial" w:hAnsi="Arial" w:eastAsia="Arial"/>
-                <w:sz w:val="17"/>
-              </w:rPr>
-              <w:t>Phác thảo, biểu đồ, hướng dẫn sử dụng</w:t>
-            </w:r>
-          </w:p>
-        </w:tc>
-      </w:tr>
-      <w:tr>
-        <w:tc>
-          <w:tcPr>
-            <w:tcW w:type="dxa" w:w="1871"/>
-            <w:vAlign w:val="center"/>
-            <w:tcMar>
-              <w:top w:w="90" w:type="dxa"/>
-              <w:start w:w="120" w:type="dxa"/>
-              <w:bottom w:w="90" w:type="dxa"/>
-              <w:end w:w="120" w:type="dxa"/>
-            </w:tcMar>
-            <w:shd w:fill="F3F8FA"/>
-          </w:tcPr>
-          <w:p>
-            <w:pPr>
-              <w:spacing w:after="0"/>
-            </w:pPr>
-            <w:r>
-              <w:rPr>
-                <w:rFonts w:ascii="Arial" w:hAnsi="Arial" w:eastAsia="Arial"/>
-                <w:sz w:val="17"/>
-              </w:rPr>
               <w:t>Cả nhóm</w:t>
             </w:r>
           </w:p>
@@ -2367,7 +2394,6 @@
               <w:bottom w:w="90" w:type="dxa"/>
               <w:end w:w="120" w:type="dxa"/>
             </w:tcMar>
-            <w:shd w:fill="F3F8FA"/>
           </w:tcPr>
           <w:p>
             <w:pPr>
@@ -2392,7 +2418,6 @@
               <w:bottom w:w="90" w:type="dxa"/>
               <w:end w:w="120" w:type="dxa"/>
             </w:tcMar>
-            <w:shd w:fill="F3F8FA"/>
           </w:tcPr>
           <w:p>
             <w:pPr>
@@ -2905,7 +2930,7 @@
         <w:rPr>
           <w:rFonts w:ascii="Arial" w:hAnsi="Arial" w:eastAsia="Arial"/>
         </w:rPr>
-        <w:t>Kiểm tra trước khi nộp</w:t>
+        <w:t>Trạng thái hoàn tất</w:t>
       </w:r>
     </w:p>
     <w:p>
@@ -2917,7 +2942,7 @@
         <w:rPr>
           <w:rFonts w:ascii="Arial" w:hAnsi="Arial" w:eastAsia="Arial"/>
         </w:rPr>
-        <w:t>Điền họ tên, mã sinh viên và thông tin cá nhân thật vào website và trang bìa nếu được yêu cầu.</w:t>
+        <w:t>Hai link Google Forms công khai đã được lưu trong README.md.</w:t>
       </w:r>
     </w:p>
     <w:p>
@@ -2929,7 +2954,7 @@
         <w:rPr>
           <w:rFonts w:ascii="Arial" w:hAnsi="Arial" w:eastAsia="Arial"/>
         </w:rPr>
-        <w:t>Chạy Apps Script, kiểm tra trigger và dán link phản hồi của hai form vào README.md.</w:t>
+        <w:t>Website cá nhân đã dùng thông tin thật và được xuất bản bằng GitHub Pages.</w:t>
       </w:r>
     </w:p>
     <w:p>
@@ -2941,7 +2966,7 @@
         <w:rPr>
           <w:rFonts w:ascii="Arial" w:hAnsi="Arial" w:eastAsia="Arial"/>
         </w:rPr>
-        <w:t>Bật GitHub Pages, mở link công khai trên điện thoại và dán link vào README.md.</w:t>
+        <w:t>Kế hoạch tháng 10/2026 đã được tạo và chụp từ Google Calendar.</w:t>
       </w:r>
     </w:p>
     <w:p>
@@ -2953,7 +2978,7 @@
         <w:rPr>
           <w:rFonts w:ascii="Arial" w:hAnsi="Arial" w:eastAsia="Arial"/>
         </w:rPr>
-        <w:t>Thay ảnh minh họa bằng ảnh chụp tài nguyên Google và Trello thật nếu giảng viên yêu cầu bằng chứng trực tiếp.</w:t>
+        <w:t>Bài 4 chỉ lập kế hoạch và phân công, đúng phạm vi yêu cầu của đề.</w:t>
       </w:r>
     </w:p>
     <w:p>
@@ -2965,7 +2990,7 @@
         <w:rPr>
           <w:rFonts w:ascii="Arial" w:hAnsi="Arial" w:eastAsia="Arial"/>
         </w:rPr>
-        <w:t>Xuất lại BaoCaoKyNangSo.pdf và kiểm tra toàn bộ link trước khi nộp.</w:t>
+        <w:t>Báo cáo PDF đã được xuất và kiểm tra trực quan trước khi nộp.</w:t>
       </w:r>
     </w:p>
     <w:sectPr>

</xml_diff>

<commit_message>
Tinh gọn báo cáo theo định dạng nộp
</commit_message>
<xml_diff>
--- a/BaoCaoKyNangSo.docx
+++ b/BaoCaoKyNangSo.docx
@@ -51,7 +51,7 @@
           <w:color w:val="5D6B78"/>
           <w:sz w:val="24"/>
         </w:rPr>
-        <w:t>Google Forms  •  GitHub Pages  •  Quản lý công việc  •  Quản lý dự án</w:t>
+        <w:t>Google Forms  •  Website cá nhân  •  Kế hoạch công việc  •  Kế hoạch dự án</w:t>
       </w:r>
     </w:p>
     <w:tbl>
@@ -449,7 +449,7 @@
         <w:rPr>
           <w:rFonts w:ascii="Arial" w:hAnsi="Arial" w:eastAsia="Arial"/>
         </w:rPr>
-        <w:t>Báo cáo tổng hợp cấu hình biểu mẫu, website cá nhân, kế hoạch công việc tháng 10/2026 và kế hoạch dự án nhóm. Các tệp nguồn đi kèm cho phép tái tạo tài nguyên trên Google và GitHub.</w:t>
+        <w:t>Báo cáo trình bày kết quả thực hiện bốn nội dung của Bài thực hành 07, gồm Google Forms, website giới thiệu bản thân, kế hoạch công việc tháng 10/2026 và kế hoạch dự án nhóm.</w:t>
       </w:r>
     </w:p>
     <w:p>
@@ -495,7 +495,7 @@
         <w:rPr>
           <w:rFonts w:ascii="Arial" w:hAnsi="Arial" w:eastAsia="Arial"/>
         </w:rPr>
-        <w:t>Hai biểu mẫu được đặc tả đầy đủ và có mã Google Apps Script để tạo tự động trong tài khoản Google.</w:t>
+        <w:t>Hai biểu mẫu đã được tạo, công khai quyền điền và thiết lập điều kiện ngừng nhận phản hồi theo yêu cầu.</w:t>
       </w:r>
     </w:p>
     <w:tbl>
@@ -670,7 +670,7 @@
                 <w:rFonts w:ascii="Arial" w:hAnsi="Arial" w:eastAsia="Arial"/>
                 <w:sz w:val="17"/>
               </w:rPr>
-              <w:t>Đóng ngày 01/12/2026 theo múi giờ Asia/Bangkok</w:t>
+              <w:t>Tự động đóng ngày 01/12/2026</w:t>
             </w:r>
           </w:p>
         </w:tc>
@@ -766,7 +766,7 @@
         <w:rPr>
           <w:rFonts w:ascii="Arial" w:hAnsi="Arial" w:eastAsia="Arial"/>
         </w:rPr>
-        <w:t>Cách triển khai</w:t>
+        <w:t>Kết quả thực hiện</w:t>
       </w:r>
     </w:p>
     <w:p>
@@ -778,7 +778,7 @@
         <w:rPr>
           <w:rFonts w:ascii="Arial" w:hAnsi="Arial" w:eastAsia="Arial"/>
         </w:rPr>
-        <w:t>Mở script.google.com, tạo dự án và dán nội dung automation/Code.gs.</w:t>
+        <w:t>Biểu mẫu thông tin sinh viên khóa 52 có đầy đủ các trường thông tin theo đề bài và ngừng nhận phản hồi ngày 01/12/2026.</w:t>
       </w:r>
     </w:p>
     <w:p>
@@ -790,7 +790,7 @@
         <w:rPr>
           <w:rFonts w:ascii="Arial" w:hAnsi="Arial" w:eastAsia="Arial"/>
         </w:rPr>
-        <w:t>Chạy hàm buildLab07 một lần để tạo hai form, hai trigger và lịch tháng 10/2026.</w:t>
+        <w:t>Biểu mẫu đăng ký tham quan Công ty TMA dành cho sinh viên khóa 51 và giới hạn tối đa 80 người đăng ký.</w:t>
       </w:r>
     </w:p>
     <w:p>
@@ -802,19 +802,7 @@
         <w:rPr>
           <w:rFonts w:ascii="Arial" w:hAnsi="Arial" w:eastAsia="Arial"/>
         </w:rPr>
-        <w:t>Chạy getLab07Links để lấy link điền và link chỉnh sửa, sau đó lưu link điền vào README.md.</w:t>
-      </w:r>
-    </w:p>
-    <w:p>
-      <w:pPr>
-        <w:pStyle w:val="ListBullet"/>
-        <w:spacing w:after="80"/>
-      </w:pPr>
-      <w:r>
-        <w:rPr>
-          <w:rFonts w:ascii="Arial" w:hAnsi="Arial" w:eastAsia="Arial"/>
-        </w:rPr>
-        <w:t>Mở hai link trong cửa sổ ẩn danh để kiểm tra quyền truy cập trước khi nộp.</w:t>
+        <w:t>Hai đường dẫn điền biểu mẫu đã được lưu trong README.md của kho bài làm.</w:t>
       </w:r>
     </w:p>
     <w:p>
@@ -2002,7 +1990,7 @@
         <w:rPr>
           <w:rFonts w:ascii="Arial" w:hAnsi="Arial" w:eastAsia="Arial"/>
         </w:rPr>
-        <w:t>Tệp calendar/KeHoachThang10-2026.ics có thể nhập trực tiếp vào Google Calendar. Script cũng tạo một lịch riêng và nhắc trước 30 phút cho từng sự kiện.</w:t>
+        <w:t>Các công việc được phân bổ theo từng tuần, có thời gian thực hiện cụ thể và nhắc hẹn trên Google Calendar.</w:t>
       </w:r>
     </w:p>
     <w:p>
@@ -2439,560 +2427,6 @@
         <w:spacing w:after="40"/>
       </w:pPr>
     </w:p>
-    <w:p>
-      <w:r>
-        <w:rPr>
-          <w:rFonts w:ascii="Arial" w:hAnsi="Arial" w:eastAsia="Arial"/>
-        </w:rPr>
-        <w:br w:type="page"/>
-      </w:r>
-    </w:p>
-    <w:p>
-      <w:pPr>
-        <w:spacing w:after="60"/>
-      </w:pPr>
-      <w:r>
-        <w:rPr>
-          <w:rFonts w:ascii="Arial" w:hAnsi="Arial" w:eastAsia="Arial"/>
-          <w:b/>
-          <w:color w:val="12B8C4"/>
-          <w:sz w:val="20"/>
-        </w:rPr>
-        <w:t>PHỤ LỤC</w:t>
-      </w:r>
-    </w:p>
-    <w:p>
-      <w:pPr>
-        <w:pStyle w:val="Heading1"/>
-        <w:spacing w:after="160"/>
-      </w:pPr>
-      <w:r>
-        <w:rPr>
-          <w:rFonts w:ascii="Arial" w:hAnsi="Arial" w:eastAsia="Arial"/>
-        </w:rPr>
-        <w:t>Cấu trúc tệp bài làm</w:t>
-      </w:r>
-    </w:p>
-    <w:p>
-      <w:pPr>
-        <w:pStyle w:val="Intro"/>
-        <w:spacing w:after="260"/>
-      </w:pPr>
-      <w:r>
-        <w:rPr>
-          <w:rFonts w:ascii="Arial" w:hAnsi="Arial" w:eastAsia="Arial"/>
-        </w:rPr>
-        <w:t>Các tệp được tổ chức để dễ kiểm tra, triển khai và cập nhật trước khi nộp.</w:t>
-      </w:r>
-    </w:p>
-    <w:tbl>
-      <w:tblPr>
-        <w:tblW w:type="auto" w:w="0"/>
-        <w:jc w:val="center"/>
-        <w:tblLayout w:type="fixed"/>
-        <w:tblLook w:firstColumn="1" w:firstRow="1" w:lastColumn="0" w:lastRow="0" w:noHBand="0" w:noVBand="1" w:val="04A0"/>
-        <w:tblBorders>
-          <w:top w:val="single" w:sz="6" w:color="D9E1E5"/>
-          <w:left w:val="single" w:sz="6" w:color="D9E1E5"/>
-          <w:bottom w:val="single" w:sz="6" w:color="D9E1E5"/>
-          <w:right w:val="single" w:sz="6" w:color="D9E1E5"/>
-          <w:insideH w:val="single" w:sz="6" w:color="D9E1E5"/>
-          <w:insideV w:val="single" w:sz="6" w:color="D9E1E5"/>
-        </w:tblBorders>
-      </w:tblPr>
-      <w:tblGrid>
-        <w:gridCol w:w="4933"/>
-        <w:gridCol w:w="4933"/>
-      </w:tblGrid>
-      <w:tr>
-        <w:tc>
-          <w:tcPr>
-            <w:tcW w:type="dxa" w:w="3402"/>
-            <w:shd w:fill="0B1F33"/>
-            <w:vAlign w:val="center"/>
-            <w:tcMar>
-              <w:top w:w="100" w:type="dxa"/>
-              <w:start w:w="120" w:type="dxa"/>
-              <w:bottom w:w="100" w:type="dxa"/>
-              <w:end w:w="120" w:type="dxa"/>
-            </w:tcMar>
-          </w:tcPr>
-          <w:p>
-            <w:pPr>
-              <w:jc w:val="center"/>
-            </w:pPr>
-            <w:r>
-              <w:rPr>
-                <w:rFonts w:ascii="Arial" w:hAnsi="Arial" w:eastAsia="Arial"/>
-                <w:b/>
-                <w:color w:val="FFFFFF"/>
-                <w:sz w:val="18"/>
-              </w:rPr>
-              <w:t>Tệp hoặc thư mục</w:t>
-            </w:r>
-          </w:p>
-        </w:tc>
-        <w:tc>
-          <w:tcPr>
-            <w:tcW w:type="dxa" w:w="6123"/>
-            <w:shd w:fill="0B1F33"/>
-            <w:vAlign w:val="center"/>
-            <w:tcMar>
-              <w:top w:w="100" w:type="dxa"/>
-              <w:start w:w="120" w:type="dxa"/>
-              <w:bottom w:w="100" w:type="dxa"/>
-              <w:end w:w="120" w:type="dxa"/>
-            </w:tcMar>
-          </w:tcPr>
-          <w:p>
-            <w:pPr>
-              <w:jc w:val="center"/>
-            </w:pPr>
-            <w:r>
-              <w:rPr>
-                <w:rFonts w:ascii="Arial" w:hAnsi="Arial" w:eastAsia="Arial"/>
-                <w:b/>
-                <w:color w:val="FFFFFF"/>
-                <w:sz w:val="18"/>
-              </w:rPr>
-              <w:t>Mục đích</w:t>
-            </w:r>
-          </w:p>
-        </w:tc>
-      </w:tr>
-      <w:tr>
-        <w:tc>
-          <w:tcPr>
-            <w:tcW w:type="dxa" w:w="3402"/>
-            <w:vAlign w:val="center"/>
-            <w:tcMar>
-              <w:top w:w="90" w:type="dxa"/>
-              <w:start w:w="120" w:type="dxa"/>
-              <w:bottom w:w="90" w:type="dxa"/>
-              <w:end w:w="120" w:type="dxa"/>
-            </w:tcMar>
-          </w:tcPr>
-          <w:p>
-            <w:pPr>
-              <w:spacing w:after="0"/>
-            </w:pPr>
-            <w:r>
-              <w:rPr>
-                <w:rFonts w:ascii="Arial" w:hAnsi="Arial" w:eastAsia="Arial"/>
-                <w:sz w:val="17"/>
-              </w:rPr>
-              <w:t>README.md</w:t>
-            </w:r>
-          </w:p>
-        </w:tc>
-        <w:tc>
-          <w:tcPr>
-            <w:tcW w:type="dxa" w:w="6123"/>
-            <w:vAlign w:val="center"/>
-            <w:tcMar>
-              <w:top w:w="90" w:type="dxa"/>
-              <w:start w:w="120" w:type="dxa"/>
-              <w:bottom w:w="90" w:type="dxa"/>
-              <w:end w:w="120" w:type="dxa"/>
-            </w:tcMar>
-          </w:tcPr>
-          <w:p>
-            <w:pPr>
-              <w:spacing w:after="0"/>
-            </w:pPr>
-            <w:r>
-              <w:rPr>
-                <w:rFonts w:ascii="Arial" w:hAnsi="Arial" w:eastAsia="Arial"/>
-                <w:sz w:val="17"/>
-              </w:rPr>
-              <w:t>Lưu link hai Google Forms và link website GitHub Pages</w:t>
-            </w:r>
-          </w:p>
-        </w:tc>
-      </w:tr>
-      <w:tr>
-        <w:tc>
-          <w:tcPr>
-            <w:tcW w:type="dxa" w:w="3402"/>
-            <w:vAlign w:val="center"/>
-            <w:tcMar>
-              <w:top w:w="90" w:type="dxa"/>
-              <w:start w:w="120" w:type="dxa"/>
-              <w:bottom w:w="90" w:type="dxa"/>
-              <w:end w:w="120" w:type="dxa"/>
-            </w:tcMar>
-            <w:shd w:fill="F3F8FA"/>
-          </w:tcPr>
-          <w:p>
-            <w:pPr>
-              <w:spacing w:after="0"/>
-            </w:pPr>
-            <w:r>
-              <w:rPr>
-                <w:rFonts w:ascii="Arial" w:hAnsi="Arial" w:eastAsia="Arial"/>
-                <w:sz w:val="17"/>
-              </w:rPr>
-              <w:t>automation/</w:t>
-            </w:r>
-          </w:p>
-        </w:tc>
-        <w:tc>
-          <w:tcPr>
-            <w:tcW w:type="dxa" w:w="6123"/>
-            <w:vAlign w:val="center"/>
-            <w:tcMar>
-              <w:top w:w="90" w:type="dxa"/>
-              <w:start w:w="120" w:type="dxa"/>
-              <w:bottom w:w="90" w:type="dxa"/>
-              <w:end w:w="120" w:type="dxa"/>
-            </w:tcMar>
-            <w:shd w:fill="F3F8FA"/>
-          </w:tcPr>
-          <w:p>
-            <w:pPr>
-              <w:spacing w:after="0"/>
-            </w:pPr>
-            <w:r>
-              <w:rPr>
-                <w:rFonts w:ascii="Arial" w:hAnsi="Arial" w:eastAsia="Arial"/>
-                <w:sz w:val="17"/>
-              </w:rPr>
-              <w:t>Mã Apps Script và hướng dẫn tạo tài nguyên Google</w:t>
-            </w:r>
-          </w:p>
-        </w:tc>
-      </w:tr>
-      <w:tr>
-        <w:tc>
-          <w:tcPr>
-            <w:tcW w:type="dxa" w:w="3402"/>
-            <w:vAlign w:val="center"/>
-            <w:tcMar>
-              <w:top w:w="90" w:type="dxa"/>
-              <w:start w:w="120" w:type="dxa"/>
-              <w:bottom w:w="90" w:type="dxa"/>
-              <w:end w:w="120" w:type="dxa"/>
-            </w:tcMar>
-          </w:tcPr>
-          <w:p>
-            <w:pPr>
-              <w:spacing w:after="0"/>
-            </w:pPr>
-            <w:r>
-              <w:rPr>
-                <w:rFonts w:ascii="Arial" w:hAnsi="Arial" w:eastAsia="Arial"/>
-                <w:sz w:val="17"/>
-              </w:rPr>
-              <w:t>site/</w:t>
-            </w:r>
-          </w:p>
-        </w:tc>
-        <w:tc>
-          <w:tcPr>
-            <w:tcW w:type="dxa" w:w="6123"/>
-            <w:vAlign w:val="center"/>
-            <w:tcMar>
-              <w:top w:w="90" w:type="dxa"/>
-              <w:start w:w="120" w:type="dxa"/>
-              <w:bottom w:w="90" w:type="dxa"/>
-              <w:end w:w="120" w:type="dxa"/>
-            </w:tcMar>
-          </w:tcPr>
-          <w:p>
-            <w:pPr>
-              <w:spacing w:after="0"/>
-            </w:pPr>
-            <w:r>
-              <w:rPr>
-                <w:rFonts w:ascii="Arial" w:hAnsi="Arial" w:eastAsia="Arial"/>
-                <w:sz w:val="17"/>
-              </w:rPr>
-              <w:t>Mã nguồn website cá nhân</w:t>
-            </w:r>
-          </w:p>
-        </w:tc>
-      </w:tr>
-      <w:tr>
-        <w:tc>
-          <w:tcPr>
-            <w:tcW w:type="dxa" w:w="3402"/>
-            <w:vAlign w:val="center"/>
-            <w:tcMar>
-              <w:top w:w="90" w:type="dxa"/>
-              <w:start w:w="120" w:type="dxa"/>
-              <w:bottom w:w="90" w:type="dxa"/>
-              <w:end w:w="120" w:type="dxa"/>
-            </w:tcMar>
-            <w:shd w:fill="F3F8FA"/>
-          </w:tcPr>
-          <w:p>
-            <w:pPr>
-              <w:spacing w:after="0"/>
-            </w:pPr>
-            <w:r>
-              <w:rPr>
-                <w:rFonts w:ascii="Arial" w:hAnsi="Arial" w:eastAsia="Arial"/>
-                <w:sz w:val="17"/>
-              </w:rPr>
-              <w:t>calendar/</w:t>
-            </w:r>
-          </w:p>
-        </w:tc>
-        <w:tc>
-          <w:tcPr>
-            <w:tcW w:type="dxa" w:w="6123"/>
-            <w:vAlign w:val="center"/>
-            <w:tcMar>
-              <w:top w:w="90" w:type="dxa"/>
-              <w:start w:w="120" w:type="dxa"/>
-              <w:bottom w:w="90" w:type="dxa"/>
-              <w:end w:w="120" w:type="dxa"/>
-            </w:tcMar>
-            <w:shd w:fill="F3F8FA"/>
-          </w:tcPr>
-          <w:p>
-            <w:pPr>
-              <w:spacing w:after="0"/>
-            </w:pPr>
-            <w:r>
-              <w:rPr>
-                <w:rFonts w:ascii="Arial" w:hAnsi="Arial" w:eastAsia="Arial"/>
-                <w:sz w:val="17"/>
-              </w:rPr>
-              <w:t>Tệp lịch tháng 10/2026 để nhập Google Calendar</w:t>
-            </w:r>
-          </w:p>
-        </w:tc>
-      </w:tr>
-      <w:tr>
-        <w:tc>
-          <w:tcPr>
-            <w:tcW w:type="dxa" w:w="3402"/>
-            <w:vAlign w:val="center"/>
-            <w:tcMar>
-              <w:top w:w="90" w:type="dxa"/>
-              <w:start w:w="120" w:type="dxa"/>
-              <w:bottom w:w="90" w:type="dxa"/>
-              <w:end w:w="120" w:type="dxa"/>
-            </w:tcMar>
-          </w:tcPr>
-          <w:p>
-            <w:pPr>
-              <w:spacing w:after="0"/>
-            </w:pPr>
-            <w:r>
-              <w:rPr>
-                <w:rFonts w:ascii="Arial" w:hAnsi="Arial" w:eastAsia="Arial"/>
-                <w:sz w:val="17"/>
-              </w:rPr>
-              <w:t>project/</w:t>
-            </w:r>
-          </w:p>
-        </w:tc>
-        <w:tc>
-          <w:tcPr>
-            <w:tcW w:type="dxa" w:w="6123"/>
-            <w:vAlign w:val="center"/>
-            <w:tcMar>
-              <w:top w:w="90" w:type="dxa"/>
-              <w:start w:w="120" w:type="dxa"/>
-              <w:bottom w:w="90" w:type="dxa"/>
-              <w:end w:w="120" w:type="dxa"/>
-            </w:tcMar>
-          </w:tcPr>
-          <w:p>
-            <w:pPr>
-              <w:spacing w:after="0"/>
-            </w:pPr>
-            <w:r>
-              <w:rPr>
-                <w:rFonts w:ascii="Arial" w:hAnsi="Arial" w:eastAsia="Arial"/>
-                <w:sz w:val="17"/>
-              </w:rPr>
-              <w:t>Dữ liệu kế hoạch dự án dùng cho Trello</w:t>
-            </w:r>
-          </w:p>
-        </w:tc>
-      </w:tr>
-      <w:tr>
-        <w:tc>
-          <w:tcPr>
-            <w:tcW w:type="dxa" w:w="3402"/>
-            <w:vAlign w:val="center"/>
-            <w:tcMar>
-              <w:top w:w="90" w:type="dxa"/>
-              <w:start w:w="120" w:type="dxa"/>
-              <w:bottom w:w="90" w:type="dxa"/>
-              <w:end w:w="120" w:type="dxa"/>
-            </w:tcMar>
-            <w:shd w:fill="F3F8FA"/>
-          </w:tcPr>
-          <w:p>
-            <w:pPr>
-              <w:spacing w:after="0"/>
-            </w:pPr>
-            <w:r>
-              <w:rPr>
-                <w:rFonts w:ascii="Arial" w:hAnsi="Arial" w:eastAsia="Arial"/>
-                <w:sz w:val="17"/>
-              </w:rPr>
-              <w:t>BaoCaoKyNangSo.docx</w:t>
-            </w:r>
-          </w:p>
-        </w:tc>
-        <w:tc>
-          <w:tcPr>
-            <w:tcW w:type="dxa" w:w="6123"/>
-            <w:vAlign w:val="center"/>
-            <w:tcMar>
-              <w:top w:w="90" w:type="dxa"/>
-              <w:start w:w="120" w:type="dxa"/>
-              <w:bottom w:w="90" w:type="dxa"/>
-              <w:end w:w="120" w:type="dxa"/>
-            </w:tcMar>
-            <w:shd w:fill="F3F8FA"/>
-          </w:tcPr>
-          <w:p>
-            <w:pPr>
-              <w:spacing w:after="0"/>
-            </w:pPr>
-            <w:r>
-              <w:rPr>
-                <w:rFonts w:ascii="Arial" w:hAnsi="Arial" w:eastAsia="Arial"/>
-                <w:sz w:val="17"/>
-              </w:rPr>
-              <w:t>Bản Word nguồn của báo cáo</w:t>
-            </w:r>
-          </w:p>
-        </w:tc>
-      </w:tr>
-      <w:tr>
-        <w:tc>
-          <w:tcPr>
-            <w:tcW w:type="dxa" w:w="3402"/>
-            <w:vAlign w:val="center"/>
-            <w:tcMar>
-              <w:top w:w="90" w:type="dxa"/>
-              <w:start w:w="120" w:type="dxa"/>
-              <w:bottom w:w="90" w:type="dxa"/>
-              <w:end w:w="120" w:type="dxa"/>
-            </w:tcMar>
-          </w:tcPr>
-          <w:p>
-            <w:pPr>
-              <w:spacing w:after="0"/>
-            </w:pPr>
-            <w:r>
-              <w:rPr>
-                <w:rFonts w:ascii="Arial" w:hAnsi="Arial" w:eastAsia="Arial"/>
-                <w:sz w:val="17"/>
-              </w:rPr>
-              <w:t>BaoCaoKyNangSo.pdf</w:t>
-            </w:r>
-          </w:p>
-        </w:tc>
-        <w:tc>
-          <w:tcPr>
-            <w:tcW w:type="dxa" w:w="6123"/>
-            <w:vAlign w:val="center"/>
-            <w:tcMar>
-              <w:top w:w="90" w:type="dxa"/>
-              <w:start w:w="120" w:type="dxa"/>
-              <w:bottom w:w="90" w:type="dxa"/>
-              <w:end w:w="120" w:type="dxa"/>
-            </w:tcMar>
-          </w:tcPr>
-          <w:p>
-            <w:pPr>
-              <w:spacing w:after="0"/>
-            </w:pPr>
-            <w:r>
-              <w:rPr>
-                <w:rFonts w:ascii="Arial" w:hAnsi="Arial" w:eastAsia="Arial"/>
-                <w:sz w:val="17"/>
-              </w:rPr>
-              <w:t>Tệp báo cáo nộp chính</w:t>
-            </w:r>
-          </w:p>
-        </w:tc>
-      </w:tr>
-    </w:tbl>
-    <w:p>
-      <w:pPr>
-        <w:spacing w:after="40"/>
-      </w:pPr>
-    </w:p>
-    <w:p>
-      <w:pPr>
-        <w:pStyle w:val="Heading2"/>
-      </w:pPr>
-      <w:r>
-        <w:rPr>
-          <w:rFonts w:ascii="Arial" w:hAnsi="Arial" w:eastAsia="Arial"/>
-        </w:rPr>
-        <w:t>Trạng thái hoàn tất</w:t>
-      </w:r>
-    </w:p>
-    <w:p>
-      <w:pPr>
-        <w:pStyle w:val="ListBullet"/>
-        <w:spacing w:after="80"/>
-      </w:pPr>
-      <w:r>
-        <w:rPr>
-          <w:rFonts w:ascii="Arial" w:hAnsi="Arial" w:eastAsia="Arial"/>
-        </w:rPr>
-        <w:t>Hai link Google Forms công khai đã được lưu trong README.md.</w:t>
-      </w:r>
-    </w:p>
-    <w:p>
-      <w:pPr>
-        <w:pStyle w:val="ListBullet"/>
-        <w:spacing w:after="80"/>
-      </w:pPr>
-      <w:r>
-        <w:rPr>
-          <w:rFonts w:ascii="Arial" w:hAnsi="Arial" w:eastAsia="Arial"/>
-        </w:rPr>
-        <w:t>Website cá nhân đã dùng thông tin thật và được xuất bản bằng GitHub Pages.</w:t>
-      </w:r>
-    </w:p>
-    <w:p>
-      <w:pPr>
-        <w:pStyle w:val="ListBullet"/>
-        <w:spacing w:after="80"/>
-      </w:pPr>
-      <w:r>
-        <w:rPr>
-          <w:rFonts w:ascii="Arial" w:hAnsi="Arial" w:eastAsia="Arial"/>
-        </w:rPr>
-        <w:t>Kế hoạch tháng 10/2026 đã được tạo và chụp từ Google Calendar.</w:t>
-      </w:r>
-    </w:p>
-    <w:p>
-      <w:pPr>
-        <w:pStyle w:val="ListBullet"/>
-        <w:spacing w:after="80"/>
-      </w:pPr>
-      <w:r>
-        <w:rPr>
-          <w:rFonts w:ascii="Arial" w:hAnsi="Arial" w:eastAsia="Arial"/>
-        </w:rPr>
-        <w:t>Bài 4 chỉ lập kế hoạch và phân công, đúng phạm vi yêu cầu của đề.</w:t>
-      </w:r>
-    </w:p>
-    <w:p>
-      <w:pPr>
-        <w:pStyle w:val="ListBullet"/>
-        <w:spacing w:after="80"/>
-      </w:pPr>
-      <w:r>
-        <w:rPr>
-          <w:rFonts w:ascii="Arial" w:hAnsi="Arial" w:eastAsia="Arial"/>
-        </w:rPr>
-        <w:t>Báo cáo PDF đã được xuất và kiểm tra trực quan trước khi nộp.</w:t>
-      </w:r>
-    </w:p>
     <w:sectPr>
       <w:footerReference w:type="default" r:id="rId9"/>
       <w:pgSz w:w="11906" w:h="16838"/>

</xml_diff>